<commit_message>
Update CV with instructor role at One Million Egyptian Coders
</commit_message>
<xml_diff>
--- a/assests/Ahmed_Mohamed_Abdo_CV.docx
+++ b/assests/Ahmed_Mohamed_Abdo_CV.docx
@@ -59,11 +59,31 @@
           <w:rPr>
             <w:rFonts w:ascii="Calibri" w:hAnsi="Calibri"/>
             <w:color w:val="000000"/>
-            <w:shd w:val="clear" w:color="auto" w:fill="DFF1FE"/>
             <w:sz w:val="18"/>
             <w:szCs w:val="18"/>
+            <w:shd w:val="clear" w:color="auto" w:fill="DFF1FE"/>
           </w:rPr>
-          <w:t xml:space="preserve"> ahmed@mohamed-abdo.com </w:t>
+          <w:t xml:space="preserve"> ahmed@mohamed-abdo.</w:t>
+        </w:r>
+        <w:r>
+          <w:rPr>
+            <w:rFonts w:ascii="Calibri" w:hAnsi="Calibri"/>
+            <w:color w:val="000000"/>
+            <w:sz w:val="18"/>
+            <w:szCs w:val="18"/>
+            <w:shd w:val="clear" w:color="auto" w:fill="DFF1FE"/>
+          </w:rPr>
+          <w:t>me</w:t>
+        </w:r>
+        <w:r>
+          <w:rPr>
+            <w:rFonts w:ascii="Calibri" w:hAnsi="Calibri"/>
+            <w:color w:val="000000"/>
+            <w:sz w:val="18"/>
+            <w:szCs w:val="18"/>
+            <w:shd w:val="clear" w:color="auto" w:fill="DFF1FE"/>
+          </w:rPr>
+          <w:t xml:space="preserve"> </w:t>
         </w:r>
       </w:hyperlink>
       <w:r>
@@ -97,9 +117,9 @@
           <w:rPr>
             <w:rFonts w:ascii="Calibri" w:hAnsi="Calibri"/>
             <w:color w:val="000000"/>
-            <w:shd w:val="clear" w:color="auto" w:fill="F2F4F5"/>
             <w:sz w:val="18"/>
             <w:szCs w:val="18"/>
+            <w:shd w:val="clear" w:color="auto" w:fill="F2F4F5"/>
           </w:rPr>
           <w:t xml:space="preserve"> github.com/a7mdabdoo </w:t>
         </w:r>
@@ -130,14 +150,14 @@
         </w:rPr>
         <w:t xml:space="preserve"> </w:t>
       </w:r>
-      <w:hyperlink r:id="rIdLinkedIn" w:history="1">
+      <w:hyperlink r:id="rId8" w:history="1">
         <w:r>
           <w:rPr>
             <w:rFonts w:ascii="Calibri" w:hAnsi="Calibri"/>
             <w:color w:val="000000"/>
-            <w:shd w:val="clear" w:color="auto" w:fill="F2F4F5"/>
             <w:sz w:val="18"/>
             <w:szCs w:val="18"/>
+            <w:shd w:val="clear" w:color="auto" w:fill="F2F4F5"/>
           </w:rPr>
           <w:t xml:space="preserve"> linkedin.com/in/ahmd-mhmd-abdo </w:t>
         </w:r>
@@ -166,15 +186,7 @@
           <w:sz w:val="18"/>
           <w:szCs w:val="18"/>
         </w:rPr>
-        <w:t xml:space="preserve"> </w:t>
-      </w:r>
-      <w:r>
-        <w:rPr>
-          <w:rFonts w:ascii="Calibri" w:hAnsi="Calibri"/>
-          <w:sz w:val="18"/>
-          <w:szCs w:val="18"/>
-        </w:rPr>
-        <w:t>Qena, Egypt</w:t>
+        <w:t xml:space="preserve"> Qena, Egypt</w:t>
       </w:r>
     </w:p>
     <w:p>
@@ -386,7 +398,7 @@
         </w:rPr>
         <w:t xml:space="preserve">GitHub: </w:t>
       </w:r>
-      <w:hyperlink r:id="rIdMinshawi" w:history="1">
+      <w:hyperlink r:id="rId9" w:history="1">
         <w:r>
           <w:rPr>
             <w:rFonts w:ascii="Calibri" w:eastAsia="Calibri" w:hAnsi="Calibri" w:cs="Calibri"/>
@@ -464,7 +476,7 @@
         </w:rPr>
         <w:t xml:space="preserve">GitHub: </w:t>
       </w:r>
-      <w:hyperlink r:id="rId8" w:history="1">
+      <w:hyperlink r:id="rId10" w:history="1">
         <w:r>
           <w:rPr>
             <w:rFonts w:ascii="Calibri" w:eastAsia="Calibri" w:hAnsi="Calibri" w:cs="Calibri"/>
@@ -556,7 +568,7 @@
         </w:rPr>
         <w:t xml:space="preserve">GitHub: </w:t>
       </w:r>
-      <w:hyperlink r:id="rId9" w:history="1">
+      <w:hyperlink r:id="rId11" w:history="1">
         <w:r>
           <w:rPr>
             <w:rFonts w:ascii="Calibri" w:eastAsia="Calibri" w:hAnsi="Calibri" w:cs="Calibri"/>
@@ -721,50 +733,24 @@
         </w:rPr>
         <w:t xml:space="preserve">GitHub: </w:t>
       </w:r>
-      <w:r>
-        <w:fldChar w:fldCharType="begin"/>
-      </w:r>
-      <w:r>
-        <w:instrText>HYPERLINK "https://github.com/A7Md3BD0/Visual-Shark-Tank"</w:instrText>
-      </w:r>
-      <w:r>
-        <w:fldChar w:fldCharType="separate"/>
-      </w:r>
-      <w:r>
-        <w:rPr>
-          <w:rFonts w:ascii="Calibri" w:eastAsia="Calibri" w:hAnsi="Calibri" w:cs="Calibri"/>
-          <w:color w:val="1155CC"/>
-          <w:u w:val="single"/>
-        </w:rPr>
-        <w:t>github.com/A7Md3BD0</w:t>
-      </w:r>
-      <w:r>
-        <w:rPr>
-          <w:rFonts w:ascii="Calibri" w:eastAsia="Calibri" w:hAnsi="Calibri" w:cs="Calibri"/>
-          <w:color w:val="1155CC"/>
-          <w:u w:val="single"/>
-        </w:rPr>
-        <w:t>/</w:t>
-      </w:r>
-      <w:r>
-        <w:rPr>
-          <w:rFonts w:ascii="Calibri" w:eastAsia="Calibri" w:hAnsi="Calibri" w:cs="Calibri"/>
-          <w:color w:val="1155CC"/>
-          <w:u w:val="single"/>
-        </w:rPr>
-        <w:t>V</w:t>
-      </w:r>
-      <w:r>
-        <w:rPr>
-          <w:rFonts w:ascii="Calibri" w:eastAsia="Calibri" w:hAnsi="Calibri" w:cs="Calibri"/>
-          <w:color w:val="1155CC"/>
-          <w:u w:val="single"/>
-        </w:rPr>
-        <w:t>isual-Shark-Tank</w:t>
-      </w:r>
-      <w:r>
-        <w:fldChar w:fldCharType="end"/>
-      </w:r>
+      <w:hyperlink r:id="rId12" w:history="1">
+        <w:r>
+          <w:rPr>
+            <w:rFonts w:ascii="Calibri" w:eastAsia="Calibri" w:hAnsi="Calibri" w:cs="Calibri"/>
+            <w:color w:val="1155CC"/>
+            <w:u w:val="single"/>
+          </w:rPr>
+          <w:t>github.com/A7Md3BD0</w:t>
+        </w:r>
+        <w:r>
+          <w:rPr>
+            <w:rFonts w:ascii="Calibri" w:eastAsia="Calibri" w:hAnsi="Calibri" w:cs="Calibri"/>
+            <w:color w:val="1155CC"/>
+            <w:u w:val="single"/>
+          </w:rPr>
+          <w:t>/Visual-Shark-Tank</w:t>
+        </w:r>
+      </w:hyperlink>
     </w:p>
     <w:p>
       <w:pPr>
@@ -832,7 +818,7 @@
         </w:rPr>
         <w:t xml:space="preserve">GitHub: </w:t>
       </w:r>
-      <w:hyperlink r:id="rId10" w:history="1">
+      <w:hyperlink r:id="rId13" w:history="1">
         <w:r>
           <w:rPr>
             <w:rFonts w:ascii="Calibri" w:eastAsia="Calibri" w:hAnsi="Calibri" w:cs="Calibri"/>
@@ -892,7 +878,7 @@
         </w:rPr>
         <w:t xml:space="preserve">GitHub: </w:t>
       </w:r>
-      <w:hyperlink r:id="rId11" w:history="1">
+      <w:hyperlink r:id="rId14" w:history="1">
         <w:r>
           <w:rPr>
             <w:rFonts w:ascii="Calibri" w:eastAsia="Calibri" w:hAnsi="Calibri" w:cs="Calibri"/>
@@ -980,7 +966,7 @@
         </w:rPr>
         <w:t xml:space="preserve">Website: </w:t>
       </w:r>
-      <w:hyperlink r:id="rId12" w:history="1">
+      <w:hyperlink r:id="rId15" w:history="1">
         <w:r>
           <w:rPr>
             <w:rFonts w:ascii="Calibri" w:eastAsia="Calibri" w:hAnsi="Calibri" w:cs="Calibri"/>
@@ -1158,7 +1144,33 @@
           <w:sz w:val="24"/>
           <w:szCs w:val="24"/>
         </w:rPr>
-        <w:t>COURSES &amp; TRAINING</w:t>
+        <w:t>EXPERIENCE &amp; TRAINING</w:t>
+      </w:r>
+    </w:p>
+    <w:p>
+      <w:pPr>
+        <w:pStyle w:val="ListParagraph"/>
+        <w:numPr>
+          <w:ilvl w:val="0"/>
+          <w:numId w:val="2"/>
+        </w:numPr>
+        <w:spacing w:before="10" w:after="10"/>
+      </w:pPr>
+      <w:r>
+        <w:rPr>
+          <w:rFonts w:ascii="Calibri" w:eastAsia="Calibri" w:hAnsi="Calibri" w:cs="Calibri"/>
+          <w:b/>
+          <w:bCs/>
+          <w:color w:val="000000"/>
+        </w:rPr>
+        <w:t xml:space="preserve">One Million Egyptian Coders (Ministry of Youth &amp; Sports): </w:t>
+      </w:r>
+      <w:r>
+        <w:rPr>
+          <w:rFonts w:ascii="Calibri" w:eastAsia="Calibri" w:hAnsi="Calibri" w:cs="Calibri"/>
+          <w:color w:val="000000"/>
+        </w:rPr>
+        <w:t>Programming &amp; AI Instructor — Mentoring youth in coding fundamentals, algorithms, and AI concepts in collaboration with Misr El-Kheir and Mawaheb Foundations.</w:t>
       </w:r>
     </w:p>
     <w:p>
@@ -1886,6 +1898,7 @@
   <w:style w:type="character" w:default="1" w:styleId="DefaultParagraphFont">
     <w:name w:val="Default Paragraph Font"/>
     <w:uiPriority w:val="1"/>
+    <w:semiHidden/>
     <w:unhideWhenUsed/>
   </w:style>
   <w:style w:type="table" w:default="1" w:styleId="TableNormal">

</xml_diff>